<commit_message>
adjusted the normal print function and is working
</commit_message>
<xml_diff>
--- a/print/template-msds/dc.docx
+++ b/print/template-msds/dc.docx
@@ -55,6 +55,18 @@
           <w:u w:val="single"/>
         </w:rPr>
       </w:pPr>
+    </w:p>
+    <w:p>
+      <w:pPr>
+        <w:pStyle w:val="Heading1"/>
+        <w:rPr>
+          <w:rFonts w:cs="Arial"/>
+          <w:b/>
+          <w:sz w:val="26"/>
+          <w:szCs w:val="26"/>
+          <w:u w:val="single"/>
+        </w:rPr>
+      </w:pPr>
       <w:r>
         <w:rPr>
           <w:rFonts w:cs="Arial"/>
@@ -85,6 +97,7 @@
         <w:tabs>
           <w:tab w:val="left" w:pos="4320"/>
         </w:tabs>
+        <w:spacing w:line="360" w:lineRule="auto"/>
         <w:rPr>
           <w:rFonts w:ascii="Arial" w:hAnsi="Arial" w:cs="Arial"/>
           <w:b/>
@@ -102,24 +115,6 @@
           <w:u w:val="single"/>
         </w:rPr>
         <w:t>Product Identification</w:t>
-      </w:r>
-    </w:p>
-    <w:p>
-      <w:pPr>
-        <w:rPr>
-          <w:rFonts w:ascii="Arial" w:hAnsi="Arial" w:cs="Arial"/>
-          <w:sz w:val="23"/>
-          <w:szCs w:val="23"/>
-        </w:rPr>
-      </w:pPr>
-      <w:r>
-        <w:rPr>
-          <w:rFonts w:ascii="Arial" w:hAnsi="Arial" w:cs="Arial"/>
-          <w:b/>
-          <w:sz w:val="23"/>
-          <w:szCs w:val="23"/>
-        </w:rPr>
-        <w:t xml:space="preserve">      </w:t>
       </w:r>
     </w:p>
     <w:tbl>
@@ -524,6 +519,7 @@
           <w:ilvl w:val="0"/>
           <w:numId w:val="1"/>
         </w:numPr>
+        <w:spacing w:line="360" w:lineRule="auto"/>
         <w:rPr>
           <w:rFonts w:ascii="Arial" w:hAnsi="Arial" w:cs="Arial"/>
           <w:b/>
@@ -542,17 +538,6 @@
         </w:rPr>
         <w:t>Composition /Information on Ingredients</w:t>
       </w:r>
-    </w:p>
-    <w:p>
-      <w:pPr>
-        <w:rPr>
-          <w:rFonts w:ascii="Arial" w:hAnsi="Arial" w:cs="Arial"/>
-          <w:b/>
-          <w:sz w:val="23"/>
-          <w:szCs w:val="23"/>
-          <w:u w:val="single"/>
-        </w:rPr>
-      </w:pPr>
     </w:p>
     <w:p>
       <w:pPr>
@@ -590,7 +575,7 @@
           <w:ilvl w:val="0"/>
           <w:numId w:val="1"/>
         </w:numPr>
-        <w:spacing w:before="0" w:after="0"/>
+        <w:spacing w:before="0" w:after="0" w:line="360" w:lineRule="auto"/>
         <w:rPr>
           <w:sz w:val="23"/>
           <w:szCs w:val="23"/>
@@ -605,16 +590,6 @@
         </w:rPr>
         <w:t>Hazard Information</w:t>
       </w:r>
-    </w:p>
-    <w:p>
-      <w:pPr>
-        <w:ind w:left="720"/>
-        <w:rPr>
-          <w:rFonts w:ascii="Arial" w:hAnsi="Arial" w:cs="Arial"/>
-          <w:sz w:val="23"/>
-          <w:szCs w:val="23"/>
-        </w:rPr>
-      </w:pPr>
     </w:p>
     <w:p>
       <w:pPr>
@@ -1109,6 +1084,7 @@
           <w:ilvl w:val="0"/>
           <w:numId w:val="1"/>
         </w:numPr>
+        <w:spacing w:line="360" w:lineRule="auto"/>
         <w:rPr>
           <w:rFonts w:ascii="Arial" w:hAnsi="Arial" w:cs="Arial"/>
           <w:b/>
@@ -1127,17 +1103,6 @@
         </w:rPr>
         <w:t>First Aid Measures</w:t>
       </w:r>
-    </w:p>
-    <w:p>
-      <w:pPr>
-        <w:spacing w:line="360" w:lineRule="auto"/>
-        <w:jc w:val="both"/>
-        <w:rPr>
-          <w:rFonts w:ascii="Arial" w:hAnsi="Arial" w:cs="Arial"/>
-          <w:sz w:val="23"/>
-          <w:szCs w:val="23"/>
-        </w:rPr>
-      </w:pPr>
     </w:p>
     <w:tbl>
       <w:tblPr>
@@ -1488,6 +1453,7 @@
           <w:ilvl w:val="0"/>
           <w:numId w:val="1"/>
         </w:numPr>
+        <w:spacing w:line="360" w:lineRule="auto"/>
         <w:rPr>
           <w:rFonts w:ascii="Arial" w:hAnsi="Arial" w:cs="Arial"/>
           <w:b/>
@@ -1506,17 +1472,6 @@
         </w:rPr>
         <w:t>Fire Fighting Measures</w:t>
       </w:r>
-    </w:p>
-    <w:p>
-      <w:pPr>
-        <w:rPr>
-          <w:rFonts w:ascii="Arial" w:hAnsi="Arial" w:cs="Arial"/>
-          <w:b/>
-          <w:sz w:val="23"/>
-          <w:szCs w:val="23"/>
-          <w:u w:val="single"/>
-        </w:rPr>
-      </w:pPr>
     </w:p>
     <w:tbl>
       <w:tblPr>
@@ -1636,6 +1591,7 @@
           <w:ilvl w:val="0"/>
           <w:numId w:val="1"/>
         </w:numPr>
+        <w:spacing w:line="360" w:lineRule="auto"/>
         <w:rPr>
           <w:rFonts w:ascii="Arial" w:hAnsi="Arial" w:cs="Arial"/>
           <w:b/>
@@ -1654,15 +1610,6 @@
         </w:rPr>
         <w:t>Accidental Release Measures</w:t>
       </w:r>
-    </w:p>
-    <w:p>
-      <w:pPr>
-        <w:rPr>
-          <w:rFonts w:ascii="Arial" w:hAnsi="Arial" w:cs="Arial"/>
-          <w:sz w:val="23"/>
-          <w:szCs w:val="23"/>
-        </w:rPr>
-      </w:pPr>
     </w:p>
     <w:p>
       <w:pPr>
@@ -1704,6 +1651,7 @@
           <w:ilvl w:val="0"/>
           <w:numId w:val="1"/>
         </w:numPr>
+        <w:spacing w:line="360" w:lineRule="auto"/>
         <w:rPr>
           <w:rFonts w:ascii="Arial" w:hAnsi="Arial" w:cs="Arial"/>
           <w:b/>
@@ -1806,7 +1754,6 @@
                 <w:sz w:val="23"/>
                 <w:szCs w:val="23"/>
               </w:rPr>
-              <w:lastRenderedPageBreak/>
               <w:t>Handling</w:t>
             </w:r>
           </w:p>
@@ -1950,6 +1897,7 @@
           <w:ilvl w:val="0"/>
           <w:numId w:val="1"/>
         </w:numPr>
+        <w:spacing w:line="360" w:lineRule="auto"/>
         <w:rPr>
           <w:rFonts w:ascii="Arial" w:hAnsi="Arial" w:cs="Arial"/>
           <w:b/>
@@ -1968,16 +1916,6 @@
         </w:rPr>
         <w:t>Exposure Controls/ Personal Protection</w:t>
       </w:r>
-    </w:p>
-    <w:p>
-      <w:pPr>
-        <w:jc w:val="both"/>
-        <w:rPr>
-          <w:rFonts w:ascii="Arial" w:hAnsi="Arial" w:cs="Arial"/>
-          <w:sz w:val="23"/>
-          <w:szCs w:val="23"/>
-        </w:rPr>
-      </w:pPr>
     </w:p>
     <w:tbl>
       <w:tblPr>
@@ -2411,6 +2349,7 @@
           <w:ilvl w:val="0"/>
           <w:numId w:val="1"/>
         </w:numPr>
+        <w:spacing w:line="360" w:lineRule="auto"/>
         <w:rPr>
           <w:rFonts w:ascii="Arial" w:hAnsi="Arial" w:cs="Arial"/>
           <w:b/>
@@ -2429,16 +2368,6 @@
         </w:rPr>
         <w:t>Physical &amp; Chemical Properties</w:t>
       </w:r>
-    </w:p>
-    <w:p>
-      <w:pPr>
-        <w:ind w:firstLine="720"/>
-        <w:rPr>
-          <w:rFonts w:ascii="Arial" w:hAnsi="Arial" w:cs="Arial"/>
-          <w:sz w:val="23"/>
-          <w:szCs w:val="23"/>
-        </w:rPr>
-      </w:pPr>
     </w:p>
     <w:tbl>
       <w:tblPr>
@@ -2562,6 +2491,7 @@
           <w:ilvl w:val="0"/>
           <w:numId w:val="1"/>
         </w:numPr>
+        <w:spacing w:line="360" w:lineRule="auto"/>
         <w:rPr>
           <w:rFonts w:ascii="Arial" w:hAnsi="Arial" w:cs="Arial"/>
           <w:b/>
@@ -2580,17 +2510,6 @@
         </w:rPr>
         <w:t>Stability &amp; Reactivity</w:t>
       </w:r>
-    </w:p>
-    <w:p>
-      <w:pPr>
-        <w:rPr>
-          <w:rFonts w:ascii="Arial" w:hAnsi="Arial" w:cs="Arial"/>
-          <w:b/>
-          <w:sz w:val="23"/>
-          <w:szCs w:val="23"/>
-          <w:u w:val="single"/>
-        </w:rPr>
-      </w:pPr>
     </w:p>
     <w:p>
       <w:pPr>
@@ -2882,6 +2801,7 @@
           <w:ilvl w:val="0"/>
           <w:numId w:val="1"/>
         </w:numPr>
+        <w:spacing w:line="360" w:lineRule="auto"/>
         <w:rPr>
           <w:rFonts w:ascii="Arial" w:hAnsi="Arial" w:cs="Arial"/>
           <w:b/>
@@ -2900,17 +2820,6 @@
         </w:rPr>
         <w:t>Toxicological Information</w:t>
       </w:r>
-    </w:p>
-    <w:p>
-      <w:pPr>
-        <w:rPr>
-          <w:rFonts w:ascii="Arial" w:hAnsi="Arial" w:cs="Arial"/>
-          <w:b/>
-          <w:sz w:val="23"/>
-          <w:szCs w:val="23"/>
-          <w:u w:val="single"/>
-        </w:rPr>
-      </w:pPr>
     </w:p>
     <w:p>
       <w:pPr>
@@ -2949,6 +2858,7 @@
           <w:ilvl w:val="0"/>
           <w:numId w:val="1"/>
         </w:numPr>
+        <w:spacing w:line="360" w:lineRule="auto"/>
         <w:rPr>
           <w:rFonts w:ascii="Arial" w:hAnsi="Arial" w:cs="Arial"/>
           <w:b/>
@@ -2967,15 +2877,6 @@
         </w:rPr>
         <w:t>Ecological Information</w:t>
       </w:r>
-    </w:p>
-    <w:p>
-      <w:pPr>
-        <w:rPr>
-          <w:rFonts w:ascii="Arial" w:hAnsi="Arial" w:cs="Arial"/>
-          <w:sz w:val="23"/>
-          <w:szCs w:val="23"/>
-        </w:rPr>
-      </w:pPr>
     </w:p>
     <w:p>
       <w:pPr>
@@ -3013,6 +2914,7 @@
           <w:ilvl w:val="0"/>
           <w:numId w:val="1"/>
         </w:numPr>
+        <w:spacing w:line="360" w:lineRule="auto"/>
         <w:rPr>
           <w:rFonts w:ascii="Arial" w:hAnsi="Arial" w:cs="Arial"/>
           <w:b/>
@@ -3031,15 +2933,6 @@
         </w:rPr>
         <w:t>Disposal</w:t>
       </w:r>
-    </w:p>
-    <w:p>
-      <w:pPr>
-        <w:rPr>
-          <w:rFonts w:ascii="Arial" w:hAnsi="Arial" w:cs="Arial"/>
-          <w:sz w:val="23"/>
-          <w:szCs w:val="23"/>
-        </w:rPr>
-      </w:pPr>
     </w:p>
     <w:p>
       <w:pPr>
@@ -3078,6 +2971,7 @@
           <w:ilvl w:val="0"/>
           <w:numId w:val="1"/>
         </w:numPr>
+        <w:spacing w:line="360" w:lineRule="auto"/>
         <w:rPr>
           <w:rFonts w:ascii="Arial" w:hAnsi="Arial" w:cs="Arial"/>
           <w:b/>
@@ -3096,17 +2990,6 @@
         </w:rPr>
         <w:t xml:space="preserve"> Transport Information</w:t>
       </w:r>
-    </w:p>
-    <w:p>
-      <w:pPr>
-        <w:rPr>
-          <w:rFonts w:ascii="Arial" w:hAnsi="Arial" w:cs="Arial"/>
-          <w:b/>
-          <w:sz w:val="23"/>
-          <w:szCs w:val="23"/>
-          <w:u w:val="single"/>
-        </w:rPr>
-      </w:pPr>
     </w:p>
     <w:p>
       <w:pPr>
@@ -3143,6 +3026,7 @@
           <w:ilvl w:val="0"/>
           <w:numId w:val="1"/>
         </w:numPr>
+        <w:spacing w:line="360" w:lineRule="auto"/>
         <w:rPr>
           <w:rFonts w:ascii="Arial" w:hAnsi="Arial" w:cs="Arial"/>
           <w:b/>
@@ -3161,15 +3045,6 @@
         </w:rPr>
         <w:t>Regulatory Information</w:t>
       </w:r>
-    </w:p>
-    <w:p>
-      <w:pPr>
-        <w:rPr>
-          <w:rFonts w:ascii="Arial" w:hAnsi="Arial" w:cs="Arial"/>
-          <w:sz w:val="23"/>
-          <w:szCs w:val="23"/>
-        </w:rPr>
-      </w:pPr>
     </w:p>
     <w:p>
       <w:pPr>
@@ -3193,17 +3068,9 @@
     </w:p>
     <w:p>
       <w:pPr>
+        <w:spacing w:after="60"/>
+        <w:ind w:left="720"/>
         <w:jc w:val="both"/>
-        <w:rPr>
-          <w:rFonts w:ascii="Arial" w:hAnsi="Arial" w:cs="Arial"/>
-          <w:sz w:val="23"/>
-          <w:szCs w:val="23"/>
-        </w:rPr>
-      </w:pPr>
-    </w:p>
-    <w:p>
-      <w:pPr>
-        <w:ind w:left="720"/>
         <w:rPr>
           <w:rFonts w:ascii="Arial" w:hAnsi="Arial" w:cs="Arial"/>
           <w:sz w:val="23"/>
@@ -3217,7 +3084,7 @@
           <w:ilvl w:val="0"/>
           <w:numId w:val="1"/>
         </w:numPr>
-        <w:spacing w:line="480" w:lineRule="auto"/>
+        <w:spacing w:line="360" w:lineRule="auto"/>
         <w:rPr>
           <w:rFonts w:ascii="Arial" w:hAnsi="Arial" w:cs="Arial"/>
           <w:b/>
@@ -3234,7 +3101,6 @@
           <w:szCs w:val="23"/>
           <w:u w:val="single"/>
         </w:rPr>
-        <w:lastRenderedPageBreak/>
         <w:t>Shelf-Life</w:t>
       </w:r>
     </w:p>
@@ -3261,6 +3127,7 @@
     <w:p>
       <w:pPr>
         <w:spacing w:after="60"/>
+        <w:ind w:left="720"/>
         <w:jc w:val="both"/>
         <w:rPr>
           <w:rFonts w:ascii="Arial" w:hAnsi="Arial" w:cs="Arial"/>
@@ -3275,7 +3142,7 @@
           <w:ilvl w:val="0"/>
           <w:numId w:val="1"/>
         </w:numPr>
-        <w:spacing w:line="480" w:lineRule="auto"/>
+        <w:spacing w:line="360" w:lineRule="auto"/>
         <w:rPr>
           <w:rFonts w:ascii="Arial" w:hAnsi="Arial" w:cs="Arial"/>
           <w:b/>
@@ -3315,30 +3182,6 @@
         <w:t>[[OTHER]]</w:t>
       </w:r>
     </w:p>
-    <w:p>
-      <w:pPr>
-        <w:rPr>
-          <w:sz w:val="23"/>
-          <w:szCs w:val="23"/>
-        </w:rPr>
-      </w:pPr>
-    </w:p>
-    <w:p>
-      <w:pPr>
-        <w:pStyle w:val="Heading1"/>
-        <w:rPr>
-          <w:sz w:val="23"/>
-          <w:szCs w:val="23"/>
-        </w:rPr>
-      </w:pPr>
-    </w:p>
-    <w:p/>
-    <w:p/>
-    <w:p/>
-    <w:p/>
-    <w:p/>
-    <w:p/>
-    <w:p/>
     <w:sectPr>
       <w:headerReference w:type="default" r:id="rId8"/>
       <w:pgSz w:w="12240" w:h="15840" w:code="1"/>
@@ -4171,11 +4014,15 @@
   </w:style>
   <w:style w:type="character" w:default="1" w:styleId="DefaultParagraphFont">
     <w:name w:val="Default Paragraph Font"/>
+    <w:uiPriority w:val="1"/>
     <w:semiHidden/>
+    <w:unhideWhenUsed/>
   </w:style>
   <w:style w:type="table" w:default="1" w:styleId="TableNormal">
     <w:name w:val="Normal Table"/>
+    <w:uiPriority w:val="99"/>
     <w:semiHidden/>
+    <w:unhideWhenUsed/>
     <w:tblPr>
       <w:tblInd w:w="0" w:type="dxa"/>
       <w:tblCellMar>
@@ -4188,7 +4035,9 @@
   </w:style>
   <w:style w:type="numbering" w:default="1" w:styleId="NoList">
     <w:name w:val="No List"/>
+    <w:uiPriority w:val="99"/>
     <w:semiHidden/>
+    <w:unhideWhenUsed/>
   </w:style>
   <w:style w:type="paragraph" w:styleId="Header">
     <w:name w:val="header"/>

</xml_diff>